<commit_message>
Updated reference name and internship experience
</commit_message>
<xml_diff>
--- a/public/Hoo Jun Zhe_resume.docx
+++ b/public/Hoo Jun Zhe_resume.docx
@@ -1693,7 +1693,7 @@
               </w:rPr>
               <w:br w:type="textWrapping"/>
               <w:br w:type="textWrapping"/>
-              <w:t xml:space="preserve">Malayan Banking Berhad –  </w:t>
+              <w:t xml:space="preserve">Malayan Banking Berhad  –  </w:t>
             </w:r>
             <w:r>
               <w:rPr>
@@ -2243,14 +2243,14 @@
                 <w:bCs w:val="1"/>
                 <w:rtl w:val="0"/>
               </w:rPr>
-              <w:t xml:space="preserve">VeecoTech Web &amp; E-Commerce – </w:t>
-            </w:r>
-            <w:r>
-              <w:rPr>
-                <w:rFonts w:ascii="Times New Roman" w:cs="Times New Roman" w:eastAsia="Times New Roman" w:hAnsi="Times New Roman"/>
-                <w:rtl w:val="0"/>
-              </w:rPr>
-              <w:t xml:space="preserve">Web Intern</w:t>
+              <w:t xml:space="preserve">VeecoTech  – </w:t>
+            </w:r>
+            <w:r>
+              <w:rPr>
+                <w:rFonts w:ascii="Times New Roman" w:cs="Times New Roman" w:eastAsia="Times New Roman" w:hAnsi="Times New Roman"/>
+                <w:rtl w:val="0"/>
+              </w:rPr>
+              <w:t xml:space="preserve">Web Development Intern</w:t>
             </w:r>
           </w:p>
           <w:p>
@@ -3316,7 +3316,7 @@
                 <w:szCs w:val="20"/>
                 <w:rtl w:val="0"/>
               </w:rPr>
-              <w:t xml:space="preserve">Name: Ms. Nur Fara’ain Binti Ebbie Izman</w:t>
+              <w:t xml:space="preserve">Name: Ms. Nur Fara’ain</w:t>
             </w:r>
           </w:p>
           <w:p>

</xml_diff>

<commit_message>
Tidy up description and job experience
</commit_message>
<xml_diff>
--- a/public/Hoo Jun Zhe_resume.docx
+++ b/public/Hoo Jun Zhe_resume.docx
@@ -79,46 +79,35 @@
         <w:r>
           <w:rPr>
             <w:rFonts w:ascii="Times New Roman" w:cs="Times New Roman" w:eastAsia="Times New Roman" w:hAnsi="Times New Roman"/>
-            <w:color w:val="0000ff"/>
+            <w:color w:val="1155cc"/>
             <w:sz w:val="20"/>
             <w:szCs w:val="20"/>
             <w:u w:val="single"/>
             <w:rtl w:val="0"/>
           </w:rPr>
-          <w:t xml:space="preserve">https://www.linkedin.com/in/hoojunzhe</w:t>
+          <w:t xml:space="preserve">LinkedIn</w:t>
         </w:r>
       </w:hyperlink>
+      <w:r>
+        <w:rPr>
+          <w:rFonts w:ascii="Times New Roman" w:cs="Times New Roman" w:eastAsia="Times New Roman" w:hAnsi="Times New Roman"/>
+          <w:sz w:val="20"/>
+          <w:szCs w:val="20"/>
+          <w:rtl w:val="0"/>
+        </w:rPr>
+        <w:t xml:space="preserve">   |    </w:t>
+      </w:r>
       <w:hyperlink r:id="rId8">
         <w:r>
           <w:rPr>
             <w:rFonts w:ascii="Times New Roman" w:cs="Times New Roman" w:eastAsia="Times New Roman" w:hAnsi="Times New Roman"/>
-            <w:color w:val="0000ff"/>
-            <w:u w:val="single"/>
-            <w:rtl w:val="0"/>
-          </w:rPr>
-          <w:t xml:space="preserve">/</w:t>
-        </w:r>
-      </w:hyperlink>
-      <w:r>
-        <w:rPr>
-          <w:rFonts w:ascii="Times New Roman" w:cs="Times New Roman" w:eastAsia="Times New Roman" w:hAnsi="Times New Roman"/>
-          <w:sz w:val="20"/>
-          <w:szCs w:val="20"/>
-          <w:rtl w:val="0"/>
-        </w:rPr>
-        <w:t xml:space="preserve">   |    </w:t>
-      </w:r>
-      <w:hyperlink r:id="rId9">
-        <w:r>
-          <w:rPr>
-            <w:rFonts w:ascii="Times New Roman" w:cs="Times New Roman" w:eastAsia="Times New Roman" w:hAnsi="Times New Roman"/>
-            <w:color w:val="0000ff"/>
+            <w:color w:val="1155cc"/>
             <w:sz w:val="20"/>
             <w:szCs w:val="20"/>
             <w:u w:val="single"/>
             <w:rtl w:val="0"/>
           </w:rPr>
-          <w:t xml:space="preserve">https://github.com/hoojunzhe</w:t>
+          <w:t xml:space="preserve">My Website</w:t>
         </w:r>
       </w:hyperlink>
       <w:r>
@@ -712,10 +701,6 @@
               <w:keepLines w:val="0"/>
               <w:pageBreakBefore w:val="0"/>
               <w:widowControl w:val="1"/>
-              <w:numPr>
-                <w:ilvl w:val="0"/>
-                <w:numId w:val="2"/>
-              </w:numPr>
               <w:pBdr>
                 <w:top w:space="0" w:sz="0" w:val="nil"/>
                 <w:left w:space="0" w:sz="0" w:val="nil"/>
@@ -725,31 +710,22 @@
               </w:pBdr>
               <w:shd w:fill="auto" w:val="clear"/>
               <w:spacing w:after="0" w:before="0" w:line="276" w:lineRule="auto"/>
-              <w:ind w:left="720" w:right="0" w:hanging="360"/>
+              <w:ind w:left="720" w:right="0" w:firstLine="0"/>
               <w:jc w:val="left"/>
               <w:rPr>
-                <w:b w:val="0"/>
-                <w:bCs w:val="0"/>
-                <w:i w:val="0"/>
-                <w:iCs w:val="0"/>
-                <w:smallCaps w:val="0"/>
-                <w:strike w:val="0"/>
-                <w:color w:val="000000"/>
-                <w:sz w:val="20"/>
-                <w:szCs w:val="20"/>
-                <w:u w:val="none"/>
-                <w:shd w:fill="auto" w:val="clear"/>
-                <w:vertAlign w:val="baseline"/>
-              </w:rPr>
-            </w:pPr>
-            <w:r>
-              <w:rPr>
-                <w:rFonts w:ascii="Times New Roman" w:cs="Times New Roman" w:eastAsia="Times New Roman" w:hAnsi="Times New Roman"/>
-                <w:sz w:val="20"/>
-                <w:szCs w:val="20"/>
-                <w:rtl w:val="0"/>
-              </w:rPr>
-              <w:t xml:space="preserve">Main PIC of SG insurance app and React Native migration project, to manage the following:</w:t>
+                <w:rFonts w:ascii="Times New Roman" w:cs="Times New Roman" w:eastAsia="Times New Roman" w:hAnsi="Times New Roman"/>
+                <w:sz w:val="20"/>
+                <w:szCs w:val="20"/>
+              </w:rPr>
+            </w:pPr>
+            <w:r>
+              <w:rPr>
+                <w:rFonts w:ascii="Times New Roman" w:cs="Times New Roman" w:eastAsia="Times New Roman" w:hAnsi="Times New Roman"/>
+                <w:sz w:val="20"/>
+                <w:szCs w:val="20"/>
+                <w:rtl w:val="0"/>
+              </w:rPr>
+              <w:t xml:space="preserve">Main consultant for SG insurance mobile app project and React Native migration project, to manage the following:</w:t>
               <w:br w:type="textWrapping"/>
             </w:r>
           </w:p>
@@ -2420,7 +2396,7 @@
         </w:rPr>
         <w:t xml:space="preserve">My Portfolio Website (</w:t>
       </w:r>
-      <w:hyperlink r:id="rId10">
+      <w:hyperlink r:id="rId9">
         <w:r>
           <w:rPr>
             <w:rFonts w:ascii="Times New Roman" w:cs="Times New Roman" w:eastAsia="Times New Roman" w:hAnsi="Times New Roman"/>
@@ -2505,7 +2481,7 @@
         </w:rPr>
         <w:t xml:space="preserve">Cryptocurrency Tracker (</w:t>
       </w:r>
-      <w:hyperlink r:id="rId11">
+      <w:hyperlink r:id="rId10">
         <w:r>
           <w:rPr>
             <w:rFonts w:ascii="Times New Roman" w:cs="Times New Roman" w:eastAsia="Times New Roman" w:hAnsi="Times New Roman"/>
@@ -2606,7 +2582,7 @@
         </w:rPr>
         <w:t xml:space="preserve">React Todo List (</w:t>
       </w:r>
-      <w:hyperlink r:id="rId12">
+      <w:hyperlink r:id="rId11">
         <w:r>
           <w:rPr>
             <w:rFonts w:ascii="Times New Roman" w:cs="Times New Roman" w:eastAsia="Times New Roman" w:hAnsi="Times New Roman"/>
@@ -2700,6 +2676,7 @@
           <w:rtl w:val="0"/>
         </w:rPr>
         <w:t xml:space="preserve">SKILLS</w:t>
+        <w:br w:type="textWrapping"/>
       </w:r>
       <w:r>
         <w:rPr>
@@ -2786,6 +2763,7 @@
           <w:rtl w:val="0"/>
         </w:rPr>
         <w:t xml:space="preserve">SPOKEN LANGUAGES</w:t>
+        <w:br w:type="textWrapping"/>
       </w:r>
     </w:p>
     <w:p>

</xml_diff>